<commit_message>
Update Timee regulation: unify header style and reflect user edits
- Match header style to existing 得意先登録規程 (MGT-002, 文書番号テーブル)
- Change approver/poster role from 管理職 to 配車係 in STEP 2/3/5
- Simplify required fields to 5 items (remove 現場責任者氏名 etc.)
- Remove ラクハイシステム from prohibited tasks
- Change emergency budget approval from 管理職 to 社長
- Remove 第9条 record-keeping section
- Set 施行日 to 令和8年6月3日; keep only 別紙１ accident report

https://claude.ai/code/session_01BgHAFjDQSmbvXBnKUF79fq
</commit_message>
<xml_diff>
--- a/サキュレ_タイミー活用社内規程.docx
+++ b/サキュレ_タイミー活用社内規程.docx
@@ -10,28 +10,31 @@
       <w:r>
         <w:rPr>
           <w:b/>
-          <w:color w:val="1F497D"/>
-          <w:sz w:val="32"/>
+          <w:color w:val="666666"/>
+          <w:sz w:val="22"/>
         </w:rPr>
-        <w:t>スポットワーカー（タイミー）活用に関する社内規程</w:t>
+        <w:t>株式会社サキュレ　社内規程</w:t>
       </w:r>
     </w:p>
     <w:p>
       <w:pPr>
+        <w:spacing w:after="240"/>
         <w:jc w:val="center"/>
       </w:pPr>
       <w:r>
         <w:rPr>
-          <w:color w:val="505050"/>
-          <w:sz w:val="20"/>
+          <w:b/>
+          <w:color w:val="1A376E"/>
+          <w:sz w:val="40"/>
         </w:rPr>
-        <w:t>株式会社サキュレ　総務・人事部門</w:t>
+        <w:t>タイミー（スポットワーク）活用に関する社内規程</w:t>
       </w:r>
     </w:p>
     <w:tbl>
       <w:tblPr>
+        <w:tblStyle w:val="TableGrid"/>
         <w:tblW w:type="auto" w:w="0"/>
-        <w:jc w:val="right"/>
+        <w:jc w:val="center"/>
         <w:tblLook w:firstColumn="1" w:firstRow="1" w:lastColumn="0" w:lastRow="0" w:noHBand="0" w:noVBand="1" w:val="04A0"/>
       </w:tblPr>
       <w:tblGrid>
@@ -43,111 +46,85 @@
       <w:tr>
         <w:tc>
           <w:tcPr>
-            <w:tcW w:type="dxa" w:w="2268"/>
+            <w:tcW w:type="dxa" w:w="1984"/>
+            <w:shd w:val="clear" w:color="auto" w:fill="D9E1F2"/>
+            <w:vAlign w:val="center"/>
           </w:tcPr>
           <w:p>
+            <w:pPr>
+              <w:jc w:val="center"/>
+            </w:pPr>
             <w:r>
               <w:rPr>
-                <w:b/>
+                <w:color w:val="1A376E"/>
                 <w:sz w:val="18"/>
               </w:rPr>
-              <w:t>制　定　日</w:t>
+              <w:t>文書番号</w:t>
+              <w:br/>
+              <w:t>MGT-002</w:t>
             </w:r>
           </w:p>
         </w:tc>
         <w:tc>
           <w:tcPr>
             <w:tcW w:type="dxa" w:w="2268"/>
+            <w:shd w:val="clear" w:color="auto" w:fill="D9E1F2"/>
+            <w:vAlign w:val="center"/>
           </w:tcPr>
           <w:p>
+            <w:pPr>
+              <w:jc w:val="center"/>
+            </w:pPr>
             <w:r>
               <w:rPr>
+                <w:color w:val="1A376E"/>
                 <w:sz w:val="18"/>
               </w:rPr>
-              <w:t xml:space="preserve">　　　年　　月　　日</w:t>
+              <w:t>制定日</w:t>
+              <w:br/>
+              <w:t>令和8年6月3日</w:t>
             </w:r>
           </w:p>
         </w:tc>
         <w:tc>
           <w:tcPr>
-            <w:tcW w:type="dxa" w:w="2268"/>
+            <w:tcW w:type="dxa" w:w="1984"/>
+            <w:shd w:val="clear" w:color="auto" w:fill="D9E1F2"/>
+            <w:vAlign w:val="center"/>
           </w:tcPr>
           <w:p>
+            <w:pPr>
+              <w:jc w:val="center"/>
+            </w:pPr>
             <w:r>
               <w:rPr>
-                <w:b/>
+                <w:color w:val="1A376E"/>
                 <w:sz w:val="18"/>
               </w:rPr>
-              <w:t>版　　数</w:t>
+              <w:t>改定日</w:t>
+              <w:br/>
+              <w:t>―</w:t>
             </w:r>
           </w:p>
         </w:tc>
         <w:tc>
           <w:tcPr>
-            <w:tcW w:type="dxa" w:w="2268"/>
+            <w:tcW w:type="dxa" w:w="2551"/>
+            <w:shd w:val="clear" w:color="auto" w:fill="D9E1F2"/>
+            <w:vAlign w:val="center"/>
           </w:tcPr>
           <w:p>
+            <w:pPr>
+              <w:jc w:val="center"/>
+            </w:pPr>
             <w:r>
               <w:rPr>
+                <w:color w:val="1A376E"/>
                 <w:sz w:val="18"/>
               </w:rPr>
-              <w:t>第１版</w:t>
-            </w:r>
-          </w:p>
-        </w:tc>
-      </w:tr>
-      <w:tr>
-        <w:tc>
-          <w:tcPr>
-            <w:tcW w:type="dxa" w:w="2268"/>
-          </w:tcPr>
-          <w:p>
-            <w:r>
-              <w:rPr>
-                <w:b/>
-                <w:sz w:val="18"/>
-              </w:rPr>
-              <w:t>最終改定日</w:t>
-            </w:r>
-          </w:p>
-        </w:tc>
-        <w:tc>
-          <w:tcPr>
-            <w:tcW w:type="dxa" w:w="2268"/>
-          </w:tcPr>
-          <w:p>
-            <w:r>
-              <w:rPr>
-                <w:sz w:val="18"/>
-              </w:rPr>
-              <w:t xml:space="preserve">　　　年　　月　　日</w:t>
-            </w:r>
-          </w:p>
-        </w:tc>
-        <w:tc>
-          <w:tcPr>
-            <w:tcW w:type="dxa" w:w="2268"/>
-          </w:tcPr>
-          <w:p>
-            <w:r>
-              <w:rPr>
-                <w:b/>
-                <w:sz w:val="18"/>
-              </w:rPr>
-              <w:t>承　認　者</w:t>
-            </w:r>
-          </w:p>
-        </w:tc>
-        <w:tc>
-          <w:tcPr>
-            <w:tcW w:type="dxa" w:w="2268"/>
-          </w:tcPr>
-          <w:p>
-            <w:r>
-              <w:rPr>
-                <w:sz w:val="18"/>
-              </w:rPr>
-              <w:t xml:space="preserve">　　　　　　　　　　</w:t>
+              <w:t>管理部門</w:t>
+              <w:br/>
+              <w:t>総務・人事部門</w:t>
             </w:r>
           </w:p>
         </w:tc>
@@ -162,7 +139,7 @@
       <w:r>
         <w:rPr>
           <w:b/>
-          <w:color w:val="1F497D"/>
+          <w:color w:val="1A376E"/>
           <w:sz w:val="24"/>
         </w:rPr>
         <w:t>第１条（目的）</w:t>
@@ -189,7 +166,7 @@
       <w:r>
         <w:rPr>
           <w:b/>
-          <w:color w:val="1F497D"/>
+          <w:color w:val="1A376E"/>
           <w:sz w:val="24"/>
         </w:rPr>
         <w:t>第２条（適用範囲）</w:t>
@@ -216,7 +193,7 @@
       <w:r>
         <w:rPr>
           <w:b/>
-          <w:color w:val="1F497D"/>
+          <w:color w:val="1A376E"/>
           <w:sz w:val="24"/>
         </w:rPr>
         <w:t>第３条（利用可能業務および禁止業務）</w:t>
@@ -264,7 +241,7 @@
         <w:tc>
           <w:tcPr>
             <w:tcW w:type="dxa" w:w="567"/>
-            <w:shd w:val="clear" w:color="auto" w:fill="2E74B5"/>
+            <w:shd w:val="clear" w:color="auto" w:fill="1A376E"/>
             <w:vAlign w:val="center"/>
           </w:tcPr>
           <w:p>
@@ -283,8 +260,8 @@
         </w:tc>
         <w:tc>
           <w:tcPr>
-            <w:tcW w:type="dxa" w:w="7654"/>
-            <w:shd w:val="clear" w:color="auto" w:fill="2E74B5"/>
+            <w:tcW w:type="dxa" w:w="8220"/>
+            <w:shd w:val="clear" w:color="auto" w:fill="1A376E"/>
             <w:vAlign w:val="center"/>
           </w:tcPr>
           <w:p>
@@ -323,7 +300,7 @@
         </w:tc>
         <w:tc>
           <w:tcPr>
-            <w:tcW w:type="dxa" w:w="7654"/>
+            <w:tcW w:type="dxa" w:w="8220"/>
             <w:shd w:val="clear" w:color="auto" w:fill="FFFFFF"/>
             <w:vAlign w:val="center"/>
           </w:tcPr>
@@ -358,7 +335,7 @@
         </w:tc>
         <w:tc>
           <w:tcPr>
-            <w:tcW w:type="dxa" w:w="7654"/>
+            <w:tcW w:type="dxa" w:w="8220"/>
             <w:shd w:val="clear" w:color="auto" w:fill="EBF3FB"/>
             <w:vAlign w:val="center"/>
           </w:tcPr>
@@ -393,7 +370,7 @@
         </w:tc>
         <w:tc>
           <w:tcPr>
-            <w:tcW w:type="dxa" w:w="7654"/>
+            <w:tcW w:type="dxa" w:w="8220"/>
             <w:shd w:val="clear" w:color="auto" w:fill="FFFFFF"/>
             <w:vAlign w:val="center"/>
           </w:tcPr>
@@ -428,7 +405,7 @@
         </w:tc>
         <w:tc>
           <w:tcPr>
-            <w:tcW w:type="dxa" w:w="7654"/>
+            <w:tcW w:type="dxa" w:w="8220"/>
             <w:shd w:val="clear" w:color="auto" w:fill="EBF3FB"/>
             <w:vAlign w:val="center"/>
           </w:tcPr>
@@ -463,7 +440,7 @@
         </w:tc>
         <w:tc>
           <w:tcPr>
-            <w:tcW w:type="dxa" w:w="7654"/>
+            <w:tcW w:type="dxa" w:w="8220"/>
             <w:shd w:val="clear" w:color="auto" w:fill="FFFFFF"/>
             <w:vAlign w:val="center"/>
           </w:tcPr>
@@ -561,7 +538,7 @@
         </w:tc>
         <w:tc>
           <w:tcPr>
-            <w:tcW w:type="dxa" w:w="2948"/>
+            <w:tcW w:type="dxa" w:w="3515"/>
             <w:shd w:val="clear" w:color="auto" w:fill="C00000"/>
             <w:vAlign w:val="center"/>
           </w:tcPr>
@@ -616,7 +593,7 @@
         </w:tc>
         <w:tc>
           <w:tcPr>
-            <w:tcW w:type="dxa" w:w="2948"/>
+            <w:tcW w:type="dxa" w:w="3515"/>
             <w:shd w:val="clear" w:color="auto" w:fill="FFFFFF"/>
             <w:vAlign w:val="center"/>
           </w:tcPr>
@@ -666,7 +643,7 @@
         </w:tc>
         <w:tc>
           <w:tcPr>
-            <w:tcW w:type="dxa" w:w="2948"/>
+            <w:tcW w:type="dxa" w:w="3515"/>
             <w:shd w:val="clear" w:color="auto" w:fill="EBF3FB"/>
             <w:vAlign w:val="center"/>
           </w:tcPr>
@@ -710,13 +687,13 @@
               <w:rPr>
                 <w:sz w:val="18"/>
               </w:rPr>
-              <w:t>ラクハイシステムへの直接アクセス・データ入力</w:t>
+              <w:t>車両の運転（社有車・リース車含む）</w:t>
             </w:r>
           </w:p>
         </w:tc>
         <w:tc>
           <w:tcPr>
-            <w:tcW w:type="dxa" w:w="2948"/>
+            <w:tcW w:type="dxa" w:w="3515"/>
             <w:shd w:val="clear" w:color="auto" w:fill="FFFFFF"/>
             <w:vAlign w:val="center"/>
           </w:tcPr>
@@ -725,7 +702,7 @@
               <w:rPr>
                 <w:sz w:val="18"/>
               </w:rPr>
-              <w:t>顧客情報・個人情報保護</w:t>
+              <w:t>事故リスク・保険適用外</w:t>
             </w:r>
           </w:p>
         </w:tc>
@@ -760,13 +737,13 @@
               <w:rPr>
                 <w:sz w:val="18"/>
               </w:rPr>
-              <w:t>車両の運転（社有車・リース車含む）</w:t>
+              <w:t>金銭・貴重品の取り扱い</w:t>
             </w:r>
           </w:p>
         </w:tc>
         <w:tc>
           <w:tcPr>
-            <w:tcW w:type="dxa" w:w="2948"/>
+            <w:tcW w:type="dxa" w:w="3515"/>
             <w:shd w:val="clear" w:color="auto" w:fill="EBF3FB"/>
             <w:vAlign w:val="center"/>
           </w:tcPr>
@@ -775,7 +752,7 @@
               <w:rPr>
                 <w:sz w:val="18"/>
               </w:rPr>
-              <w:t>事故リスク・保険適用外</w:t>
+              <w:t>不正リスク</w:t>
             </w:r>
           </w:p>
         </w:tc>
@@ -810,64 +787,14 @@
               <w:rPr>
                 <w:sz w:val="18"/>
               </w:rPr>
-              <w:t>金銭・貴重品の取り扱い</w:t>
-            </w:r>
-          </w:p>
-        </w:tc>
-        <w:tc>
-          <w:tcPr>
-            <w:tcW w:type="dxa" w:w="2948"/>
-            <w:shd w:val="clear" w:color="auto" w:fill="FFFFFF"/>
-            <w:vAlign w:val="center"/>
-          </w:tcPr>
-          <w:p>
-            <w:r>
-              <w:rPr>
-                <w:sz w:val="18"/>
-              </w:rPr>
-              <w:t>不正リスク</w:t>
-            </w:r>
-          </w:p>
-        </w:tc>
-      </w:tr>
-      <w:tr>
-        <w:tc>
-          <w:tcPr>
-            <w:tcW w:type="dxa" w:w="454"/>
-            <w:shd w:val="clear" w:color="auto" w:fill="EBF3FB"/>
-            <w:vAlign w:val="center"/>
-          </w:tcPr>
-          <w:p>
-            <w:pPr>
-              <w:jc w:val="center"/>
-            </w:pPr>
-            <w:r>
-              <w:rPr>
-                <w:sz w:val="18"/>
-              </w:rPr>
-              <w:t>⑥</w:t>
-            </w:r>
-          </w:p>
-        </w:tc>
-        <w:tc>
-          <w:tcPr>
-            <w:tcW w:type="dxa" w:w="4819"/>
-            <w:shd w:val="clear" w:color="auto" w:fill="EBF3FB"/>
-            <w:vAlign w:val="center"/>
-          </w:tcPr>
-          <w:p>
-            <w:r>
-              <w:rPr>
-                <w:sz w:val="18"/>
-              </w:rPr>
               <w:t>顧客との直接交渉・商談</w:t>
             </w:r>
           </w:p>
         </w:tc>
         <w:tc>
           <w:tcPr>
-            <w:tcW w:type="dxa" w:w="2948"/>
-            <w:shd w:val="clear" w:color="auto" w:fill="EBF3FB"/>
+            <w:tcW w:type="dxa" w:w="3515"/>
+            <w:shd w:val="clear" w:color="auto" w:fill="FFFFFF"/>
             <w:vAlign w:val="center"/>
           </w:tcPr>
           <w:p>
@@ -889,7 +816,7 @@
       <w:r>
         <w:rPr>
           <w:b/>
-          <w:color w:val="1F497D"/>
+          <w:color w:val="1A376E"/>
           <w:sz w:val="24"/>
         </w:rPr>
         <w:t>第４条（利用申請手続き）</w:t>
@@ -926,7 +853,7 @@
         <w:tc>
           <w:tcPr>
             <w:tcW w:type="dxa" w:w="567"/>
-            <w:shd w:val="clear" w:color="auto" w:fill="2E74B5"/>
+            <w:shd w:val="clear" w:color="auto" w:fill="1A376E"/>
             <w:vAlign w:val="center"/>
           </w:tcPr>
           <w:p>
@@ -944,8 +871,8 @@
         </w:tc>
         <w:tc>
           <w:tcPr>
-            <w:tcW w:type="dxa" w:w="1020"/>
-            <w:shd w:val="clear" w:color="auto" w:fill="2E74B5"/>
+            <w:tcW w:type="dxa" w:w="1134"/>
+            <w:shd w:val="clear" w:color="auto" w:fill="1A376E"/>
             <w:vAlign w:val="center"/>
           </w:tcPr>
           <w:p>
@@ -964,8 +891,8 @@
         </w:tc>
         <w:tc>
           <w:tcPr>
-            <w:tcW w:type="dxa" w:w="1814"/>
-            <w:shd w:val="clear" w:color="auto" w:fill="2E74B5"/>
+            <w:tcW w:type="dxa" w:w="1984"/>
+            <w:shd w:val="clear" w:color="auto" w:fill="1A376E"/>
             <w:vAlign w:val="center"/>
           </w:tcPr>
           <w:p>
@@ -984,8 +911,8 @@
         </w:tc>
         <w:tc>
           <w:tcPr>
-            <w:tcW w:type="dxa" w:w="5386"/>
-            <w:shd w:val="clear" w:color="auto" w:fill="2E74B5"/>
+            <w:tcW w:type="dxa" w:w="5102"/>
+            <w:shd w:val="clear" w:color="auto" w:fill="1A376E"/>
             <w:vAlign w:val="center"/>
           </w:tcPr>
           <w:p>
@@ -1024,7 +951,7 @@
         </w:tc>
         <w:tc>
           <w:tcPr>
-            <w:tcW w:type="dxa" w:w="1020"/>
+            <w:tcW w:type="dxa" w:w="1134"/>
             <w:shd w:val="clear" w:color="auto" w:fill="FFFFFF"/>
             <w:vAlign w:val="center"/>
           </w:tcPr>
@@ -1039,7 +966,7 @@
         </w:tc>
         <w:tc>
           <w:tcPr>
-            <w:tcW w:type="dxa" w:w="1814"/>
+            <w:tcW w:type="dxa" w:w="1984"/>
             <w:shd w:val="clear" w:color="auto" w:fill="FFFFFF"/>
             <w:vAlign w:val="center"/>
           </w:tcPr>
@@ -1054,7 +981,7 @@
         </w:tc>
         <w:tc>
           <w:tcPr>
-            <w:tcW w:type="dxa" w:w="5386"/>
+            <w:tcW w:type="dxa" w:w="5102"/>
             <w:shd w:val="clear" w:color="auto" w:fill="FFFFFF"/>
             <w:vAlign w:val="center"/>
           </w:tcPr>
@@ -1063,7 +990,7 @@
               <w:rPr>
                 <w:sz w:val="18"/>
               </w:rPr>
-              <w:t>利用申請書（別紙１）を作成し、管理職へ提出（原則3営業日前まで）</w:t>
+              <w:t>業務内容・必要人数・日時・現場住所をTeamsで配車係へ提出（原則作業日の1週間前まで）</w:t>
             </w:r>
           </w:p>
         </w:tc>
@@ -1089,7 +1016,7 @@
         </w:tc>
         <w:tc>
           <w:tcPr>
-            <w:tcW w:type="dxa" w:w="1020"/>
+            <w:tcW w:type="dxa" w:w="1134"/>
             <w:shd w:val="clear" w:color="auto" w:fill="EBF3FB"/>
             <w:vAlign w:val="center"/>
           </w:tcPr>
@@ -1104,7 +1031,7 @@
         </w:tc>
         <w:tc>
           <w:tcPr>
-            <w:tcW w:type="dxa" w:w="1814"/>
+            <w:tcW w:type="dxa" w:w="1984"/>
             <w:shd w:val="clear" w:color="auto" w:fill="EBF3FB"/>
             <w:vAlign w:val="center"/>
           </w:tcPr>
@@ -1113,13 +1040,13 @@
               <w:rPr>
                 <w:sz w:val="18"/>
               </w:rPr>
-              <w:t>管理職</w:t>
+              <w:t>配車係</w:t>
             </w:r>
           </w:p>
         </w:tc>
         <w:tc>
           <w:tcPr>
-            <w:tcW w:type="dxa" w:w="5386"/>
+            <w:tcW w:type="dxa" w:w="5102"/>
             <w:shd w:val="clear" w:color="auto" w:fill="EBF3FB"/>
             <w:vAlign w:val="center"/>
           </w:tcPr>
@@ -1154,7 +1081,7 @@
         </w:tc>
         <w:tc>
           <w:tcPr>
-            <w:tcW w:type="dxa" w:w="1020"/>
+            <w:tcW w:type="dxa" w:w="1134"/>
             <w:shd w:val="clear" w:color="auto" w:fill="FFFFFF"/>
             <w:vAlign w:val="center"/>
           </w:tcPr>
@@ -1169,7 +1096,7 @@
         </w:tc>
         <w:tc>
           <w:tcPr>
-            <w:tcW w:type="dxa" w:w="1814"/>
+            <w:tcW w:type="dxa" w:w="1984"/>
             <w:shd w:val="clear" w:color="auto" w:fill="FFFFFF"/>
             <w:vAlign w:val="center"/>
           </w:tcPr>
@@ -1178,13 +1105,13 @@
               <w:rPr>
                 <w:sz w:val="18"/>
               </w:rPr>
-              <w:t>総務 / 管理職</w:t>
+              <w:t>配車係</w:t>
             </w:r>
           </w:p>
         </w:tc>
         <w:tc>
           <w:tcPr>
-            <w:tcW w:type="dxa" w:w="5386"/>
+            <w:tcW w:type="dxa" w:w="5102"/>
             <w:shd w:val="clear" w:color="auto" w:fill="FFFFFF"/>
             <w:vAlign w:val="center"/>
           </w:tcPr>
@@ -1193,7 +1120,7 @@
               <w:rPr>
                 <w:sz w:val="18"/>
               </w:rPr>
-              <w:t>タイミーアプリ上で求人を作成・公開（掲載責任者は各拠点管理職）</w:t>
+              <w:t>タイミー管理者アプリ上で求人を作成・公開</w:t>
             </w:r>
           </w:p>
         </w:tc>
@@ -1219,7 +1146,7 @@
         </w:tc>
         <w:tc>
           <w:tcPr>
-            <w:tcW w:type="dxa" w:w="1020"/>
+            <w:tcW w:type="dxa" w:w="1134"/>
             <w:shd w:val="clear" w:color="auto" w:fill="EBF3FB"/>
             <w:vAlign w:val="center"/>
           </w:tcPr>
@@ -1234,7 +1161,7 @@
         </w:tc>
         <w:tc>
           <w:tcPr>
-            <w:tcW w:type="dxa" w:w="1814"/>
+            <w:tcW w:type="dxa" w:w="1984"/>
             <w:shd w:val="clear" w:color="auto" w:fill="EBF3FB"/>
             <w:vAlign w:val="center"/>
           </w:tcPr>
@@ -1243,13 +1170,13 @@
               <w:rPr>
                 <w:sz w:val="18"/>
               </w:rPr>
-              <w:t>現場責任者</w:t>
+              <w:t>現場責任者or現場担当者</w:t>
             </w:r>
           </w:p>
         </w:tc>
         <w:tc>
           <w:tcPr>
-            <w:tcW w:type="dxa" w:w="5386"/>
+            <w:tcW w:type="dxa" w:w="5102"/>
             <w:shd w:val="clear" w:color="auto" w:fill="EBF3FB"/>
             <w:vAlign w:val="center"/>
           </w:tcPr>
@@ -1284,7 +1211,7 @@
         </w:tc>
         <w:tc>
           <w:tcPr>
-            <w:tcW w:type="dxa" w:w="1020"/>
+            <w:tcW w:type="dxa" w:w="1134"/>
             <w:shd w:val="clear" w:color="auto" w:fill="FFFFFF"/>
             <w:vAlign w:val="center"/>
           </w:tcPr>
@@ -1299,7 +1226,7 @@
         </w:tc>
         <w:tc>
           <w:tcPr>
-            <w:tcW w:type="dxa" w:w="1814"/>
+            <w:tcW w:type="dxa" w:w="1984"/>
             <w:shd w:val="clear" w:color="auto" w:fill="FFFFFF"/>
             <w:vAlign w:val="center"/>
           </w:tcPr>
@@ -1308,13 +1235,13 @@
               <w:rPr>
                 <w:sz w:val="18"/>
               </w:rPr>
-              <w:t>現場責任者</w:t>
+              <w:t>配車係</w:t>
             </w:r>
           </w:p>
         </w:tc>
         <w:tc>
           <w:tcPr>
-            <w:tcW w:type="dxa" w:w="5386"/>
+            <w:tcW w:type="dxa" w:w="5102"/>
             <w:shd w:val="clear" w:color="auto" w:fill="FFFFFF"/>
             <w:vAlign w:val="center"/>
           </w:tcPr>
@@ -1323,7 +1250,7 @@
               <w:rPr>
                 <w:sz w:val="18"/>
               </w:rPr>
-              <w:t>業務完了確認・評価入力・実績記録</w:t>
+              <w:t>業務完了報告を受けてタイミー管理者アプリにて評価入力・実績記録</w:t>
             </w:r>
           </w:p>
         </w:tc>
@@ -1349,7 +1276,7 @@
         </w:tc>
         <w:tc>
           <w:tcPr>
-            <w:tcW w:type="dxa" w:w="1020"/>
+            <w:tcW w:type="dxa" w:w="1134"/>
             <w:shd w:val="clear" w:color="auto" w:fill="EBF3FB"/>
             <w:vAlign w:val="center"/>
           </w:tcPr>
@@ -1364,7 +1291,7 @@
         </w:tc>
         <w:tc>
           <w:tcPr>
-            <w:tcW w:type="dxa" w:w="1814"/>
+            <w:tcW w:type="dxa" w:w="1984"/>
             <w:shd w:val="clear" w:color="auto" w:fill="EBF3FB"/>
             <w:vAlign w:val="center"/>
           </w:tcPr>
@@ -1373,13 +1300,13 @@
               <w:rPr>
                 <w:sz w:val="18"/>
               </w:rPr>
-              <w:t>総務 / 経理</w:t>
+              <w:t>経理</w:t>
             </w:r>
           </w:p>
         </w:tc>
         <w:tc>
           <w:tcPr>
-            <w:tcW w:type="dxa" w:w="5386"/>
+            <w:tcW w:type="dxa" w:w="5102"/>
             <w:shd w:val="clear" w:color="auto" w:fill="EBF3FB"/>
             <w:vAlign w:val="center"/>
           </w:tcPr>
@@ -1405,7 +1332,7 @@
           <w:color w:val="2E74B5"/>
           <w:sz w:val="21"/>
         </w:rPr>
-        <w:t>（２）申請書（別紙１）の必須記載事項</w:t>
+        <w:t>（２）申請時の必須記載事項</w:t>
       </w:r>
     </w:p>
     <w:p>
@@ -1418,7 +1345,7 @@
           <w:b w:val="0"/>
           <w:sz w:val="20"/>
         </w:rPr>
-        <w:t>申請書には以下の項目を必ず記載すること。</w:t>
+        <w:t>申請時には以下の項目を必ず記載すること。</w:t>
       </w:r>
     </w:p>
     <w:tbl>
@@ -1437,7 +1364,7 @@
         <w:tc>
           <w:tcPr>
             <w:tcW w:type="dxa" w:w="454"/>
-            <w:shd w:val="clear" w:color="auto" w:fill="2E74B5"/>
+            <w:shd w:val="clear" w:color="auto" w:fill="1A376E"/>
             <w:vAlign w:val="center"/>
           </w:tcPr>
           <w:p>
@@ -1457,7 +1384,7 @@
         <w:tc>
           <w:tcPr>
             <w:tcW w:type="dxa" w:w="1984"/>
-            <w:shd w:val="clear" w:color="auto" w:fill="2E74B5"/>
+            <w:shd w:val="clear" w:color="auto" w:fill="1A376E"/>
             <w:vAlign w:val="center"/>
           </w:tcPr>
           <w:p>
@@ -1476,8 +1403,8 @@
         </w:tc>
         <w:tc>
           <w:tcPr>
-            <w:tcW w:type="dxa" w:w="5783"/>
-            <w:shd w:val="clear" w:color="auto" w:fill="2E74B5"/>
+            <w:tcW w:type="dxa" w:w="6350"/>
+            <w:shd w:val="clear" w:color="auto" w:fill="1A376E"/>
             <w:vAlign w:val="center"/>
           </w:tcPr>
           <w:p>
@@ -1531,7 +1458,7 @@
         </w:tc>
         <w:tc>
           <w:tcPr>
-            <w:tcW w:type="dxa" w:w="5783"/>
+            <w:tcW w:type="dxa" w:w="6350"/>
             <w:shd w:val="clear" w:color="auto" w:fill="FFFFFF"/>
             <w:vAlign w:val="center"/>
           </w:tcPr>
@@ -1540,7 +1467,7 @@
               <w:rPr>
                 <w:sz w:val="18"/>
               </w:rPr>
-              <w:t>開始・終了時刻を明記（例：2025年○月○日　9:00〜17:00）</w:t>
+              <w:t>開始・終了時刻を明記（例：2026年○月○日　9:00〜12:00）</w:t>
             </w:r>
           </w:p>
         </w:tc>
@@ -1581,7 +1508,7 @@
         </w:tc>
         <w:tc>
           <w:tcPr>
-            <w:tcW w:type="dxa" w:w="5783"/>
+            <w:tcW w:type="dxa" w:w="6350"/>
             <w:shd w:val="clear" w:color="auto" w:fill="EBF3FB"/>
             <w:vAlign w:val="center"/>
           </w:tcPr>
@@ -1631,7 +1558,7 @@
         </w:tc>
         <w:tc>
           <w:tcPr>
-            <w:tcW w:type="dxa" w:w="5783"/>
+            <w:tcW w:type="dxa" w:w="6350"/>
             <w:shd w:val="clear" w:color="auto" w:fill="FFFFFF"/>
             <w:vAlign w:val="center"/>
           </w:tcPr>
@@ -1681,7 +1608,7 @@
         </w:tc>
         <w:tc>
           <w:tcPr>
-            <w:tcW w:type="dxa" w:w="5783"/>
+            <w:tcW w:type="dxa" w:w="6350"/>
             <w:shd w:val="clear" w:color="auto" w:fill="EBF3FB"/>
             <w:vAlign w:val="center"/>
           </w:tcPr>
@@ -1725,13 +1652,13 @@
               <w:rPr>
                 <w:sz w:val="18"/>
               </w:rPr>
-              <w:t>現場責任者氏名</w:t>
+              <w:t>服装・持ち物</w:t>
             </w:r>
           </w:p>
         </w:tc>
         <w:tc>
           <w:tcPr>
-            <w:tcW w:type="dxa" w:w="5783"/>
+            <w:tcW w:type="dxa" w:w="6350"/>
             <w:shd w:val="clear" w:color="auto" w:fill="FFFFFF"/>
             <w:vAlign w:val="center"/>
           </w:tcPr>
@@ -1740,107 +1667,7 @@
               <w:rPr>
                 <w:sz w:val="18"/>
               </w:rPr>
-              <w:t>スポットワーカーの直接監督者（当社正社員・固定スタッフ）</w:t>
-            </w:r>
-          </w:p>
-        </w:tc>
-      </w:tr>
-      <w:tr>
-        <w:tc>
-          <w:tcPr>
-            <w:tcW w:type="dxa" w:w="454"/>
-            <w:shd w:val="clear" w:color="auto" w:fill="EBF3FB"/>
-            <w:vAlign w:val="center"/>
-          </w:tcPr>
-          <w:p>
-            <w:pPr>
-              <w:jc w:val="center"/>
-            </w:pPr>
-            <w:r>
-              <w:rPr>
-                <w:sz w:val="18"/>
-              </w:rPr>
-              <w:t>⑥</w:t>
-            </w:r>
-          </w:p>
-        </w:tc>
-        <w:tc>
-          <w:tcPr>
-            <w:tcW w:type="dxa" w:w="1984"/>
-            <w:shd w:val="clear" w:color="auto" w:fill="EBF3FB"/>
-            <w:vAlign w:val="center"/>
-          </w:tcPr>
-          <w:p>
-            <w:r>
-              <w:rPr>
-                <w:sz w:val="18"/>
-              </w:rPr>
-              <w:t>服装・持ち物</w:t>
-            </w:r>
-          </w:p>
-        </w:tc>
-        <w:tc>
-          <w:tcPr>
-            <w:tcW w:type="dxa" w:w="5783"/>
-            <w:shd w:val="clear" w:color="auto" w:fill="EBF3FB"/>
-            <w:vAlign w:val="center"/>
-          </w:tcPr>
-          <w:p>
-            <w:r>
-              <w:rPr>
-                <w:sz w:val="18"/>
-              </w:rPr>
               <w:t>安全靴・手袋の要否など</w:t>
-            </w:r>
-          </w:p>
-        </w:tc>
-      </w:tr>
-      <w:tr>
-        <w:tc>
-          <w:tcPr>
-            <w:tcW w:type="dxa" w:w="454"/>
-            <w:shd w:val="clear" w:color="auto" w:fill="FFFFFF"/>
-            <w:vAlign w:val="center"/>
-          </w:tcPr>
-          <w:p>
-            <w:pPr>
-              <w:jc w:val="center"/>
-            </w:pPr>
-            <w:r>
-              <w:rPr>
-                <w:sz w:val="18"/>
-              </w:rPr>
-              <w:t>⑦</w:t>
-            </w:r>
-          </w:p>
-        </w:tc>
-        <w:tc>
-          <w:tcPr>
-            <w:tcW w:type="dxa" w:w="1984"/>
-            <w:shd w:val="clear" w:color="auto" w:fill="FFFFFF"/>
-            <w:vAlign w:val="center"/>
-          </w:tcPr>
-          <w:p>
-            <w:r>
-              <w:rPr>
-                <w:sz w:val="18"/>
-              </w:rPr>
-              <w:t>緊急連絡先</w:t>
-            </w:r>
-          </w:p>
-        </w:tc>
-        <w:tc>
-          <w:tcPr>
-            <w:tcW w:type="dxa" w:w="5783"/>
-            <w:shd w:val="clear" w:color="auto" w:fill="FFFFFF"/>
-            <w:vAlign w:val="center"/>
-          </w:tcPr>
-          <w:p>
-            <w:r>
-              <w:rPr>
-                <w:sz w:val="18"/>
-              </w:rPr>
-              <w:t>当日連絡可能な携帯番号</w:t>
             </w:r>
           </w:p>
         </w:tc>
@@ -1854,7 +1681,7 @@
       <w:r>
         <w:rPr>
           <w:b/>
-          <w:color w:val="1F497D"/>
+          <w:color w:val="1A376E"/>
           <w:sz w:val="24"/>
         </w:rPr>
         <w:t>第５条（当日の受け入れ手順）</w:t>
@@ -1870,7 +1697,7 @@
           <w:b w:val="0"/>
           <w:sz w:val="20"/>
         </w:rPr>
-        <w:t>現場責任者は、スポットワーカーの業務開始前に以下をすべて実施しなければならない。</w:t>
+        <w:t>現場責任者・現場担当者は、スポットワーカーの業務開始前に以下をすべて実施しなければならない。</w:t>
       </w:r>
     </w:p>
     <w:tbl>
@@ -1889,7 +1716,7 @@
         <w:tc>
           <w:tcPr>
             <w:tcW w:type="dxa" w:w="454"/>
-            <w:shd w:val="clear" w:color="auto" w:fill="2E74B5"/>
+            <w:shd w:val="clear" w:color="auto" w:fill="1A376E"/>
             <w:vAlign w:val="center"/>
           </w:tcPr>
           <w:p>
@@ -1908,8 +1735,8 @@
         </w:tc>
         <w:tc>
           <w:tcPr>
-            <w:tcW w:type="dxa" w:w="1701"/>
-            <w:shd w:val="clear" w:color="auto" w:fill="2E74B5"/>
+            <w:tcW w:type="dxa" w:w="1814"/>
+            <w:shd w:val="clear" w:color="auto" w:fill="1A376E"/>
             <w:vAlign w:val="center"/>
           </w:tcPr>
           <w:p>
@@ -1928,8 +1755,8 @@
         </w:tc>
         <w:tc>
           <w:tcPr>
-            <w:tcW w:type="dxa" w:w="6066"/>
-            <w:shd w:val="clear" w:color="auto" w:fill="2E74B5"/>
+            <w:tcW w:type="dxa" w:w="6520"/>
+            <w:shd w:val="clear" w:color="auto" w:fill="1A376E"/>
             <w:vAlign w:val="center"/>
           </w:tcPr>
           <w:p>
@@ -1968,7 +1795,7 @@
         </w:tc>
         <w:tc>
           <w:tcPr>
-            <w:tcW w:type="dxa" w:w="1701"/>
+            <w:tcW w:type="dxa" w:w="1814"/>
             <w:shd w:val="clear" w:color="auto" w:fill="FFFFFF"/>
             <w:vAlign w:val="center"/>
           </w:tcPr>
@@ -1983,7 +1810,7 @@
         </w:tc>
         <w:tc>
           <w:tcPr>
-            <w:tcW w:type="dxa" w:w="6066"/>
+            <w:tcW w:type="dxa" w:w="6520"/>
             <w:shd w:val="clear" w:color="auto" w:fill="FFFFFF"/>
             <w:vAlign w:val="center"/>
           </w:tcPr>
@@ -1992,7 +1819,7 @@
               <w:rPr>
                 <w:sz w:val="18"/>
               </w:rPr>
-              <w:t>タイミーアプリで顔写真・氏名を照合。身分証の提示を求めてはならない（タイミー規約上の禁止事項）</w:t>
+              <w:t>配車係から氏名を連絡受けて本人と照合。身分証の提示を求めてはならない（タイミー規約上の禁止事項）</w:t>
             </w:r>
           </w:p>
         </w:tc>
@@ -2018,7 +1845,7 @@
         </w:tc>
         <w:tc>
           <w:tcPr>
-            <w:tcW w:type="dxa" w:w="1701"/>
+            <w:tcW w:type="dxa" w:w="1814"/>
             <w:shd w:val="clear" w:color="auto" w:fill="EBF3FB"/>
             <w:vAlign w:val="center"/>
           </w:tcPr>
@@ -2028,13 +1855,13 @@
                 <w:color w:val="C00000"/>
                 <w:sz w:val="18"/>
               </w:rPr>
-              <w:t>安全教育（⚠️必須）</w:t>
+              <w:t>⚠️ 安全教育（必須）</w:t>
             </w:r>
           </w:p>
         </w:tc>
         <w:tc>
           <w:tcPr>
-            <w:tcW w:type="dxa" w:w="6066"/>
+            <w:tcW w:type="dxa" w:w="6520"/>
             <w:shd w:val="clear" w:color="auto" w:fill="EBF3FB"/>
             <w:vAlign w:val="center"/>
           </w:tcPr>
@@ -2043,7 +1870,7 @@
               <w:rPr>
                 <w:sz w:val="18"/>
               </w:rPr>
-              <w:t>入構ルール・危険箇所・緊急時避難経路・体調不良時の報告先を口頭説明。記録簿に署名させること</w:t>
+              <w:t>入構ルール・危険箇所・緊急時避難経路・体調不良時の報告先を口頭説明</w:t>
             </w:r>
           </w:p>
         </w:tc>
@@ -2069,7 +1896,7 @@
         </w:tc>
         <w:tc>
           <w:tcPr>
-            <w:tcW w:type="dxa" w:w="1701"/>
+            <w:tcW w:type="dxa" w:w="1814"/>
             <w:shd w:val="clear" w:color="auto" w:fill="FFFFFF"/>
             <w:vAlign w:val="center"/>
           </w:tcPr>
@@ -2084,7 +1911,7 @@
         </w:tc>
         <w:tc>
           <w:tcPr>
-            <w:tcW w:type="dxa" w:w="6066"/>
+            <w:tcW w:type="dxa" w:w="6520"/>
             <w:shd w:val="clear" w:color="auto" w:fill="FFFFFF"/>
             <w:vAlign w:val="center"/>
           </w:tcPr>
@@ -2119,7 +1946,7 @@
         </w:tc>
         <w:tc>
           <w:tcPr>
-            <w:tcW w:type="dxa" w:w="1701"/>
+            <w:tcW w:type="dxa" w:w="1814"/>
             <w:shd w:val="clear" w:color="auto" w:fill="EBF3FB"/>
             <w:vAlign w:val="center"/>
           </w:tcPr>
@@ -2134,7 +1961,7 @@
         </w:tc>
         <w:tc>
           <w:tcPr>
-            <w:tcW w:type="dxa" w:w="6066"/>
+            <w:tcW w:type="dxa" w:w="6520"/>
             <w:shd w:val="clear" w:color="auto" w:fill="EBF3FB"/>
             <w:vAlign w:val="center"/>
           </w:tcPr>
@@ -2169,7 +1996,7 @@
         </w:tc>
         <w:tc>
           <w:tcPr>
-            <w:tcW w:type="dxa" w:w="1701"/>
+            <w:tcW w:type="dxa" w:w="1814"/>
             <w:shd w:val="clear" w:color="auto" w:fill="FFFFFF"/>
             <w:vAlign w:val="center"/>
           </w:tcPr>
@@ -2184,7 +2011,7 @@
         </w:tc>
         <w:tc>
           <w:tcPr>
-            <w:tcW w:type="dxa" w:w="6066"/>
+            <w:tcW w:type="dxa" w:w="6520"/>
             <w:shd w:val="clear" w:color="auto" w:fill="FFFFFF"/>
             <w:vAlign w:val="center"/>
           </w:tcPr>
@@ -2207,7 +2034,7 @@
       <w:r>
         <w:rPr>
           <w:b/>
-          <w:color w:val="1F497D"/>
+          <w:color w:val="1A376E"/>
           <w:sz w:val="24"/>
         </w:rPr>
         <w:t>第６条（安全管理・労災対応）</w:t>
@@ -2262,7 +2089,7 @@
           <w:b w:val="0"/>
           <w:sz w:val="20"/>
         </w:rPr>
-        <w:t xml:space="preserve">　　（イ）管理職および総務部門へ速報</w:t>
+        <w:t xml:space="preserve">　　（イ）配車係および総務部門へ速報</w:t>
       </w:r>
     </w:p>
     <w:p>
@@ -2288,7 +2115,7 @@
           <w:b w:val="0"/>
           <w:sz w:val="20"/>
         </w:rPr>
-        <w:t xml:space="preserve">　　（エ）事故報告書（別紙２）の作成・提出（発生当日中）</w:t>
+        <w:t xml:space="preserve">　　（エ）事故報告書（別紙１）の作成・提出（発生当日中）</w:t>
       </w:r>
     </w:p>
     <w:p>
@@ -2302,7 +2129,7 @@
           <w:color w:val="C00000"/>
           <w:sz w:val="20"/>
         </w:rPr>
-        <w:t>３　産業廃棄物エリアへの無断立ち入りが発覚した場合、即時業務終了とし、その旨をタイミーへ報告する。</w:t>
+        <w:t>３　無断立ち入りや業務命令に従わない場合、即時業務終了とし、その旨をタイミーへ報告する。</w:t>
       </w:r>
     </w:p>
     <w:p>
@@ -2313,7 +2140,7 @@
       <w:r>
         <w:rPr>
           <w:b/>
-          <w:color w:val="1F497D"/>
+          <w:color w:val="1A376E"/>
           <w:sz w:val="24"/>
         </w:rPr>
         <w:t>第７条（個人情報・機密情報の取り扱い）</w:t>
@@ -2342,20 +2169,7 @@
           <w:b w:val="0"/>
           <w:sz w:val="20"/>
         </w:rPr>
-        <w:t>２　スポットワーカーを顧客情報、社内財務情報、ラクハイシステムのデータ等に接触させてはならない。</w:t>
-      </w:r>
-    </w:p>
-    <w:p>
-      <w:pPr>
-        <w:spacing w:after="40"/>
-        <w:ind w:left="0"/>
-      </w:pPr>
-      <w:r>
-        <w:rPr>
-          <w:b w:val="0"/>
-          <w:sz w:val="20"/>
-        </w:rPr>
-        <w:t>３　業務上知り得た機密情報の保護について、受け入れ当日に口頭で説明し、誓約書（タイミー所定様式またはタイミーアプリ上の同意）を確認すること。</w:t>
+        <w:t>２　スポットワーカーを顧客情報、社内財務情報に接触させてはならない。</w:t>
       </w:r>
     </w:p>
     <w:p>
@@ -2366,7 +2180,7 @@
       <w:r>
         <w:rPr>
           <w:b/>
-          <w:color w:val="1F497D"/>
+          <w:color w:val="1A376E"/>
           <w:sz w:val="24"/>
         </w:rPr>
         <w:t>第８条（費用処理）</w:t>
@@ -2408,7 +2222,7 @@
           <w:b w:val="0"/>
           <w:sz w:val="20"/>
         </w:rPr>
-        <w:t>３　予算外の緊急利用については、管理職の事前承認および事後の稟議報告を要する。</w:t>
+        <w:t>３　予算外の緊急利用については、社長の事前承認および事後の稟議報告を要する。</w:t>
       </w:r>
     </w:p>
     <w:tbl>
@@ -2427,7 +2241,7 @@
         <w:tc>
           <w:tcPr>
             <w:tcW w:type="dxa" w:w="1984"/>
-            <w:shd w:val="clear" w:color="auto" w:fill="2E74B5"/>
+            <w:shd w:val="clear" w:color="auto" w:fill="1A376E"/>
             <w:vAlign w:val="center"/>
           </w:tcPr>
           <w:p>
@@ -2446,8 +2260,8 @@
         </w:tc>
         <w:tc>
           <w:tcPr>
-            <w:tcW w:type="dxa" w:w="3969"/>
-            <w:shd w:val="clear" w:color="auto" w:fill="2E74B5"/>
+            <w:tcW w:type="dxa" w:w="4252"/>
+            <w:shd w:val="clear" w:color="auto" w:fill="1A376E"/>
             <w:vAlign w:val="center"/>
           </w:tcPr>
           <w:p>
@@ -2466,8 +2280,8 @@
         </w:tc>
         <w:tc>
           <w:tcPr>
-            <w:tcW w:type="dxa" w:w="2268"/>
-            <w:shd w:val="clear" w:color="auto" w:fill="2E74B5"/>
+            <w:tcW w:type="dxa" w:w="2551"/>
+            <w:shd w:val="clear" w:color="auto" w:fill="1A376E"/>
             <w:vAlign w:val="center"/>
           </w:tcPr>
           <w:p>
@@ -2506,7 +2320,7 @@
         </w:tc>
         <w:tc>
           <w:tcPr>
-            <w:tcW w:type="dxa" w:w="3969"/>
+            <w:tcW w:type="dxa" w:w="4252"/>
             <w:shd w:val="clear" w:color="auto" w:fill="FFFFFF"/>
             <w:vAlign w:val="center"/>
           </w:tcPr>
@@ -2521,7 +2335,7 @@
         </w:tc>
         <w:tc>
           <w:tcPr>
-            <w:tcW w:type="dxa" w:w="2268"/>
+            <w:tcW w:type="dxa" w:w="2551"/>
             <w:shd w:val="clear" w:color="auto" w:fill="FFFFFF"/>
             <w:vAlign w:val="center"/>
           </w:tcPr>
@@ -2556,7 +2370,7 @@
         </w:tc>
         <w:tc>
           <w:tcPr>
-            <w:tcW w:type="dxa" w:w="3969"/>
+            <w:tcW w:type="dxa" w:w="4252"/>
             <w:shd w:val="clear" w:color="auto" w:fill="EBF3FB"/>
             <w:vAlign w:val="center"/>
           </w:tcPr>
@@ -2571,7 +2385,7 @@
         </w:tc>
         <w:tc>
           <w:tcPr>
-            <w:tcW w:type="dxa" w:w="2268"/>
+            <w:tcW w:type="dxa" w:w="2551"/>
             <w:shd w:val="clear" w:color="auto" w:fill="EBF3FB"/>
             <w:vAlign w:val="center"/>
           </w:tcPr>
@@ -2606,7 +2420,7 @@
         </w:tc>
         <w:tc>
           <w:tcPr>
-            <w:tcW w:type="dxa" w:w="3969"/>
+            <w:tcW w:type="dxa" w:w="4252"/>
             <w:shd w:val="clear" w:color="auto" w:fill="FFFFFF"/>
             <w:vAlign w:val="center"/>
           </w:tcPr>
@@ -2621,7 +2435,7 @@
         </w:tc>
         <w:tc>
           <w:tcPr>
-            <w:tcW w:type="dxa" w:w="2268"/>
+            <w:tcW w:type="dxa" w:w="2551"/>
             <w:shd w:val="clear" w:color="auto" w:fill="FFFFFF"/>
             <w:vAlign w:val="center"/>
           </w:tcPr>
@@ -2644,393 +2458,10 @@
       <w:r>
         <w:rPr>
           <w:b/>
-          <w:color w:val="1F497D"/>
+          <w:color w:val="1A376E"/>
           <w:sz w:val="24"/>
         </w:rPr>
-        <w:t>第９条（記録・保管）</w:t>
-      </w:r>
-    </w:p>
-    <w:p>
-      <w:pPr>
-        <w:spacing w:after="40"/>
-        <w:ind w:left="0"/>
-      </w:pPr>
-      <w:r>
-        <w:rPr>
-          <w:b w:val="0"/>
-          <w:sz w:val="20"/>
-        </w:rPr>
-        <w:t>現場責任者は以下の記録を作成し、総務部門が３年間保管する。</w:t>
-      </w:r>
-    </w:p>
-    <w:tbl>
-      <w:tblPr>
-        <w:tblStyle w:val="TableGrid"/>
-        <w:tblW w:type="auto" w:w="0"/>
-        <w:jc w:val="left"/>
-        <w:tblLook w:firstColumn="1" w:firstRow="1" w:lastColumn="0" w:lastRow="0" w:noHBand="0" w:noVBand="1" w:val="04A0"/>
-      </w:tblPr>
-      <w:tblGrid>
-        <w:gridCol w:w="2268"/>
-        <w:gridCol w:w="2268"/>
-        <w:gridCol w:w="2268"/>
-        <w:gridCol w:w="2268"/>
-      </w:tblGrid>
-      <w:tr>
-        <w:tc>
-          <w:tcPr>
-            <w:tcW w:type="dxa" w:w="2835"/>
-            <w:shd w:val="clear" w:color="auto" w:fill="2E74B5"/>
-            <w:vAlign w:val="center"/>
-          </w:tcPr>
-          <w:p>
-            <w:pPr>
-              <w:jc w:val="center"/>
-            </w:pPr>
-            <w:r>
-              <w:rPr>
-                <w:b/>
-                <w:color w:val="FFFFFF"/>
-                <w:sz w:val="18"/>
-              </w:rPr>
-              <w:t>書類名</w:t>
-            </w:r>
-          </w:p>
-        </w:tc>
-        <w:tc>
-          <w:tcPr>
-            <w:tcW w:type="dxa" w:w="1984"/>
-            <w:shd w:val="clear" w:color="auto" w:fill="2E74B5"/>
-            <w:vAlign w:val="center"/>
-          </w:tcPr>
-          <w:p>
-            <w:pPr>
-              <w:jc w:val="center"/>
-            </w:pPr>
-            <w:r>
-              <w:rPr>
-                <w:b/>
-                <w:color w:val="FFFFFF"/>
-                <w:sz w:val="18"/>
-              </w:rPr>
-              <w:t>作成タイミング</w:t>
-            </w:r>
-          </w:p>
-        </w:tc>
-        <w:tc>
-          <w:tcPr>
-            <w:tcW w:type="dxa" w:w="1984"/>
-            <w:shd w:val="clear" w:color="auto" w:fill="2E74B5"/>
-            <w:vAlign w:val="center"/>
-          </w:tcPr>
-          <w:p>
-            <w:pPr>
-              <w:jc w:val="center"/>
-            </w:pPr>
-            <w:r>
-              <w:rPr>
-                <w:b/>
-                <w:color w:val="FFFFFF"/>
-                <w:sz w:val="18"/>
-              </w:rPr>
-              <w:t>提出先</w:t>
-            </w:r>
-          </w:p>
-        </w:tc>
-        <w:tc>
-          <w:tcPr>
-            <w:tcW w:type="dxa" w:w="1417"/>
-            <w:shd w:val="clear" w:color="auto" w:fill="2E74B5"/>
-            <w:vAlign w:val="center"/>
-          </w:tcPr>
-          <w:p>
-            <w:pPr>
-              <w:jc w:val="center"/>
-            </w:pPr>
-            <w:r>
-              <w:rPr>
-                <w:b/>
-                <w:color w:val="FFFFFF"/>
-                <w:sz w:val="18"/>
-              </w:rPr>
-              <w:t>保管期間</w:t>
-            </w:r>
-          </w:p>
-        </w:tc>
-      </w:tr>
-      <w:tr>
-        <w:tc>
-          <w:tcPr>
-            <w:tcW w:type="dxa" w:w="2835"/>
-            <w:shd w:val="clear" w:color="auto" w:fill="FFFFFF"/>
-            <w:vAlign w:val="center"/>
-          </w:tcPr>
-          <w:p>
-            <w:pPr>
-              <w:jc w:val="center"/>
-            </w:pPr>
-            <w:r>
-              <w:rPr>
-                <w:sz w:val="18"/>
-              </w:rPr>
-              <w:t>利用申請書（別紙１）</w:t>
-            </w:r>
-          </w:p>
-        </w:tc>
-        <w:tc>
-          <w:tcPr>
-            <w:tcW w:type="dxa" w:w="1984"/>
-            <w:shd w:val="clear" w:color="auto" w:fill="FFFFFF"/>
-            <w:vAlign w:val="center"/>
-          </w:tcPr>
-          <w:p>
-            <w:r>
-              <w:rPr>
-                <w:sz w:val="18"/>
-              </w:rPr>
-              <w:t>各利用ごとに作成</w:t>
-            </w:r>
-          </w:p>
-        </w:tc>
-        <w:tc>
-          <w:tcPr>
-            <w:tcW w:type="dxa" w:w="1984"/>
-            <w:shd w:val="clear" w:color="auto" w:fill="FFFFFF"/>
-            <w:vAlign w:val="center"/>
-          </w:tcPr>
-          <w:p>
-            <w:r>
-              <w:rPr>
-                <w:sz w:val="18"/>
-              </w:rPr>
-              <w:t>総務部門</w:t>
-            </w:r>
-          </w:p>
-        </w:tc>
-        <w:tc>
-          <w:tcPr>
-            <w:tcW w:type="dxa" w:w="1417"/>
-            <w:shd w:val="clear" w:color="auto" w:fill="FFFFFF"/>
-            <w:vAlign w:val="center"/>
-          </w:tcPr>
-          <w:p>
-            <w:r>
-              <w:rPr>
-                <w:sz w:val="18"/>
-              </w:rPr>
-              <w:t>３年</w:t>
-            </w:r>
-          </w:p>
-        </w:tc>
-      </w:tr>
-      <w:tr>
-        <w:tc>
-          <w:tcPr>
-            <w:tcW w:type="dxa" w:w="2835"/>
-            <w:shd w:val="clear" w:color="auto" w:fill="EBF3FB"/>
-            <w:vAlign w:val="center"/>
-          </w:tcPr>
-          <w:p>
-            <w:pPr>
-              <w:jc w:val="center"/>
-            </w:pPr>
-            <w:r>
-              <w:rPr>
-                <w:sz w:val="18"/>
-              </w:rPr>
-              <w:t>当日安全教育記録（署名欄付き）</w:t>
-            </w:r>
-          </w:p>
-        </w:tc>
-        <w:tc>
-          <w:tcPr>
-            <w:tcW w:type="dxa" w:w="1984"/>
-            <w:shd w:val="clear" w:color="auto" w:fill="EBF3FB"/>
-            <w:vAlign w:val="center"/>
-          </w:tcPr>
-          <w:p>
-            <w:r>
-              <w:rPr>
-                <w:sz w:val="18"/>
-              </w:rPr>
-              <w:t>当日作成</w:t>
-            </w:r>
-          </w:p>
-        </w:tc>
-        <w:tc>
-          <w:tcPr>
-            <w:tcW w:type="dxa" w:w="1984"/>
-            <w:shd w:val="clear" w:color="auto" w:fill="EBF3FB"/>
-            <w:vAlign w:val="center"/>
-          </w:tcPr>
-          <w:p>
-            <w:r>
-              <w:rPr>
-                <w:sz w:val="18"/>
-              </w:rPr>
-              <w:t>現場責任者 → 総務</w:t>
-            </w:r>
-          </w:p>
-        </w:tc>
-        <w:tc>
-          <w:tcPr>
-            <w:tcW w:type="dxa" w:w="1417"/>
-            <w:shd w:val="clear" w:color="auto" w:fill="EBF3FB"/>
-            <w:vAlign w:val="center"/>
-          </w:tcPr>
-          <w:p>
-            <w:r>
-              <w:rPr>
-                <w:sz w:val="18"/>
-              </w:rPr>
-              <w:t>３年</w:t>
-            </w:r>
-          </w:p>
-        </w:tc>
-      </w:tr>
-      <w:tr>
-        <w:tc>
-          <w:tcPr>
-            <w:tcW w:type="dxa" w:w="2835"/>
-            <w:shd w:val="clear" w:color="auto" w:fill="FFFFFF"/>
-            <w:vAlign w:val="center"/>
-          </w:tcPr>
-          <w:p>
-            <w:pPr>
-              <w:jc w:val="center"/>
-            </w:pPr>
-            <w:r>
-              <w:rPr>
-                <w:sz w:val="18"/>
-              </w:rPr>
-              <w:t>実績記録（日時・人数・住所・業務内容）</w:t>
-            </w:r>
-          </w:p>
-        </w:tc>
-        <w:tc>
-          <w:tcPr>
-            <w:tcW w:type="dxa" w:w="1984"/>
-            <w:shd w:val="clear" w:color="auto" w:fill="FFFFFF"/>
-            <w:vAlign w:val="center"/>
-          </w:tcPr>
-          <w:p>
-            <w:r>
-              <w:rPr>
-                <w:sz w:val="18"/>
-              </w:rPr>
-              <w:t>月次でまとめて提出</w:t>
-            </w:r>
-          </w:p>
-        </w:tc>
-        <w:tc>
-          <w:tcPr>
-            <w:tcW w:type="dxa" w:w="1984"/>
-            <w:shd w:val="clear" w:color="auto" w:fill="FFFFFF"/>
-            <w:vAlign w:val="center"/>
-          </w:tcPr>
-          <w:p>
-            <w:r>
-              <w:rPr>
-                <w:sz w:val="18"/>
-              </w:rPr>
-              <w:t>現場責任者</w:t>
-            </w:r>
-          </w:p>
-        </w:tc>
-        <w:tc>
-          <w:tcPr>
-            <w:tcW w:type="dxa" w:w="1417"/>
-            <w:shd w:val="clear" w:color="auto" w:fill="FFFFFF"/>
-            <w:vAlign w:val="center"/>
-          </w:tcPr>
-          <w:p>
-            <w:r>
-              <w:rPr>
-                <w:sz w:val="18"/>
-              </w:rPr>
-              <w:t>３年</w:t>
-            </w:r>
-          </w:p>
-        </w:tc>
-      </w:tr>
-      <w:tr>
-        <w:tc>
-          <w:tcPr>
-            <w:tcW w:type="dxa" w:w="2835"/>
-            <w:shd w:val="clear" w:color="auto" w:fill="EBF3FB"/>
-            <w:vAlign w:val="center"/>
-          </w:tcPr>
-          <w:p>
-            <w:pPr>
-              <w:jc w:val="center"/>
-            </w:pPr>
-            <w:r>
-              <w:rPr>
-                <w:sz w:val="18"/>
-              </w:rPr>
-              <w:t>事故報告書（別紙２）</w:t>
-            </w:r>
-          </w:p>
-        </w:tc>
-        <w:tc>
-          <w:tcPr>
-            <w:tcW w:type="dxa" w:w="1984"/>
-            <w:shd w:val="clear" w:color="auto" w:fill="EBF3FB"/>
-            <w:vAlign w:val="center"/>
-          </w:tcPr>
-          <w:p>
-            <w:r>
-              <w:rPr>
-                <w:sz w:val="18"/>
-              </w:rPr>
-              <w:t>事故発生時のみ</w:t>
-            </w:r>
-          </w:p>
-        </w:tc>
-        <w:tc>
-          <w:tcPr>
-            <w:tcW w:type="dxa" w:w="1984"/>
-            <w:shd w:val="clear" w:color="auto" w:fill="EBF3FB"/>
-            <w:vAlign w:val="center"/>
-          </w:tcPr>
-          <w:p>
-            <w:r>
-              <w:rPr>
-                <w:sz w:val="18"/>
-              </w:rPr>
-              <w:t>現場責任者 → 総務</w:t>
-            </w:r>
-          </w:p>
-        </w:tc>
-        <w:tc>
-          <w:tcPr>
-            <w:tcW w:type="dxa" w:w="1417"/>
-            <w:shd w:val="clear" w:color="auto" w:fill="EBF3FB"/>
-            <w:vAlign w:val="center"/>
-          </w:tcPr>
-          <w:p>
-            <w:r>
-              <w:rPr>
-                <w:sz w:val="18"/>
-              </w:rPr>
-              <w:t>５年</w:t>
-            </w:r>
-          </w:p>
-        </w:tc>
-      </w:tr>
-    </w:tbl>
-    <w:p>
-      <w:pPr>
-        <w:spacing w:before="240" w:after="80"/>
-        <w:jc w:val="left"/>
-      </w:pPr>
-      <w:r>
-        <w:rPr>
-          <w:b/>
-          <w:color w:val="1F497D"/>
-          <w:sz w:val="24"/>
-        </w:rPr>
-        <w:t>第10条（規程違反時の対応）</w:t>
+        <w:t>第９条（規程違反時の対応）</w:t>
       </w:r>
     </w:p>
     <w:p>
@@ -3070,7 +2501,7 @@
           <w:b w:val="0"/>
           <w:sz w:val="20"/>
         </w:rPr>
-        <w:t xml:space="preserve">　・申請手続き未履行の場合：管理職による指導・再発防止策の提出</w:t>
+        <w:t xml:space="preserve">　・申請手続き未履行の場合：指導・再発防止策の提出</w:t>
       </w:r>
     </w:p>
     <w:p>
@@ -3094,7 +2525,7 @@
       <w:r>
         <w:rPr>
           <w:b/>
-          <w:color w:val="1F497D"/>
+          <w:color w:val="1A376E"/>
           <w:sz w:val="24"/>
         </w:rPr>
         <w:t>附　則</w:t>
@@ -3110,7 +2541,7 @@
           <w:b w:val="0"/>
           <w:sz w:val="20"/>
         </w:rPr>
-        <w:t>本規程は、　　　年　　月　　日より施行する。</w:t>
+        <w:t>本規程は、令和8年6月3日より施行する。</w:t>
       </w:r>
     </w:p>
     <w:p>
@@ -3126,8 +2557,6 @@
         <w:t>改定が必要な場合は、総務・人事部門が原案を作成し、代表取締役の承認を得て改定する。</w:t>
       </w:r>
     </w:p>
-    <w:p/>
-    <w:p/>
     <w:p>
       <w:r>
         <w:br w:type="page"/>
@@ -3135,453 +2564,15 @@
     </w:p>
     <w:p>
       <w:pPr>
-        <w:spacing w:before="240" w:after="80"/>
         <w:jc w:val="center"/>
       </w:pPr>
       <w:r>
         <w:rPr>
           <w:b/>
-          <w:color w:val="1F497D"/>
-          <w:sz w:val="24"/>
+          <w:color w:val="1A376E"/>
+          <w:sz w:val="28"/>
         </w:rPr>
-        <w:t>【別紙１】　タイミー利用申請書</w:t>
-      </w:r>
-    </w:p>
-    <w:p>
-      <w:pPr>
-        <w:jc w:val="right"/>
-      </w:pPr>
-      <w:r>
-        <w:rPr>
-          <w:sz w:val="20"/>
-        </w:rPr>
-        <w:t>申請日：　　　年　　月　　日</w:t>
-      </w:r>
-    </w:p>
-    <w:tbl>
-      <w:tblPr>
-        <w:tblStyle w:val="TableGrid"/>
-        <w:tblW w:type="auto" w:w="0"/>
-        <w:tblLook w:firstColumn="1" w:firstRow="1" w:lastColumn="0" w:lastRow="0" w:noHBand="0" w:noVBand="1" w:val="04A0"/>
-      </w:tblPr>
-      <w:tblGrid>
-        <w:gridCol w:w="4536"/>
-        <w:gridCol w:w="4536"/>
-      </w:tblGrid>
-      <w:tr>
-        <w:tc>
-          <w:tcPr>
-            <w:tcW w:type="dxa" w:w="2551"/>
-            <w:shd w:val="clear" w:color="auto" w:fill="D9E1F2"/>
-          </w:tcPr>
-          <w:p>
-            <w:r>
-              <w:rPr>
-                <w:b/>
-                <w:sz w:val="18"/>
-              </w:rPr>
-              <w:t>申請者氏名</w:t>
-            </w:r>
-          </w:p>
-        </w:tc>
-        <w:tc>
-          <w:tcPr>
-            <w:tcW w:type="dxa" w:w="6236"/>
-          </w:tcPr>
-          <w:p>
-            <w:r>
-              <w:rPr>
-                <w:sz w:val="18"/>
-              </w:rPr>
-              <w:t xml:space="preserve">　　　　　　　　　　　　　</w:t>
-            </w:r>
-          </w:p>
-        </w:tc>
-      </w:tr>
-      <w:tr>
-        <w:tc>
-          <w:tcPr>
-            <w:tcW w:type="dxa" w:w="2551"/>
-            <w:shd w:val="clear" w:color="auto" w:fill="D9E1F2"/>
-          </w:tcPr>
-          <w:p>
-            <w:r>
-              <w:rPr>
-                <w:b/>
-                <w:sz w:val="18"/>
-              </w:rPr>
-              <w:t>所属部門・拠点</w:t>
-            </w:r>
-          </w:p>
-        </w:tc>
-        <w:tc>
-          <w:tcPr>
-            <w:tcW w:type="dxa" w:w="6236"/>
-          </w:tcPr>
-          <w:p>
-            <w:r>
-              <w:rPr>
-                <w:sz w:val="18"/>
-              </w:rPr>
-              <w:t xml:space="preserve">　　　　　　　　　　　　　</w:t>
-            </w:r>
-          </w:p>
-        </w:tc>
-      </w:tr>
-      <w:tr>
-        <w:tc>
-          <w:tcPr>
-            <w:tcW w:type="dxa" w:w="2551"/>
-            <w:shd w:val="clear" w:color="auto" w:fill="D9E1F2"/>
-          </w:tcPr>
-          <w:p>
-            <w:r>
-              <w:rPr>
-                <w:b/>
-                <w:sz w:val="18"/>
-              </w:rPr>
-              <w:t>承認者（管理職）</w:t>
-            </w:r>
-          </w:p>
-        </w:tc>
-        <w:tc>
-          <w:tcPr>
-            <w:tcW w:type="dxa" w:w="6236"/>
-          </w:tcPr>
-          <w:p>
-            <w:r>
-              <w:rPr>
-                <w:sz w:val="18"/>
-              </w:rPr>
-              <w:t xml:space="preserve">　　　　　　　　　　　　　</w:t>
-            </w:r>
-          </w:p>
-        </w:tc>
-      </w:tr>
-      <w:tr>
-        <w:tc>
-          <w:tcPr>
-            <w:tcW w:type="dxa" w:w="2551"/>
-            <w:shd w:val="clear" w:color="auto" w:fill="D9E1F2"/>
-          </w:tcPr>
-          <w:p>
-            <w:r>
-              <w:rPr>
-                <w:b/>
-                <w:sz w:val="18"/>
-              </w:rPr>
-              <w:t>利用日時（開始）</w:t>
-            </w:r>
-          </w:p>
-        </w:tc>
-        <w:tc>
-          <w:tcPr>
-            <w:tcW w:type="dxa" w:w="6236"/>
-          </w:tcPr>
-          <w:p>
-            <w:r>
-              <w:rPr>
-                <w:sz w:val="18"/>
-              </w:rPr>
-              <w:t xml:space="preserve">　　　年　　月　　日　　時　　分</w:t>
-            </w:r>
-          </w:p>
-        </w:tc>
-      </w:tr>
-      <w:tr>
-        <w:tc>
-          <w:tcPr>
-            <w:tcW w:type="dxa" w:w="2551"/>
-            <w:shd w:val="clear" w:color="auto" w:fill="D9E1F2"/>
-          </w:tcPr>
-          <w:p>
-            <w:r>
-              <w:rPr>
-                <w:b/>
-                <w:sz w:val="18"/>
-              </w:rPr>
-              <w:t>利用日時（終了）</w:t>
-            </w:r>
-          </w:p>
-        </w:tc>
-        <w:tc>
-          <w:tcPr>
-            <w:tcW w:type="dxa" w:w="6236"/>
-          </w:tcPr>
-          <w:p>
-            <w:r>
-              <w:rPr>
-                <w:sz w:val="18"/>
-              </w:rPr>
-              <w:t xml:space="preserve">　　　年　　月　　日　　時　　分</w:t>
-            </w:r>
-          </w:p>
-        </w:tc>
-      </w:tr>
-      <w:tr>
-        <w:tc>
-          <w:tcPr>
-            <w:tcW w:type="dxa" w:w="2551"/>
-            <w:shd w:val="clear" w:color="auto" w:fill="D9E1F2"/>
-          </w:tcPr>
-          <w:p>
-            <w:r>
-              <w:rPr>
-                <w:b/>
-                <w:sz w:val="18"/>
-              </w:rPr>
-              <w:t>勤務場所（現地住所）</w:t>
-            </w:r>
-          </w:p>
-        </w:tc>
-        <w:tc>
-          <w:tcPr>
-            <w:tcW w:type="dxa" w:w="6236"/>
-          </w:tcPr>
-          <w:p>
-            <w:r>
-              <w:rPr>
-                <w:sz w:val="18"/>
-              </w:rPr>
-              <w:t xml:space="preserve">〒　　　－　　　　</w:t>
-              <w:br/>
-              <w:t xml:space="preserve">　　　　　　　　　　　　　　　　　　　　　　</w:t>
-            </w:r>
-          </w:p>
-        </w:tc>
-      </w:tr>
-      <w:tr>
-        <w:tc>
-          <w:tcPr>
-            <w:tcW w:type="dxa" w:w="2551"/>
-            <w:shd w:val="clear" w:color="auto" w:fill="D9E1F2"/>
-          </w:tcPr>
-          <w:p>
-            <w:r>
-              <w:rPr>
-                <w:b/>
-                <w:sz w:val="18"/>
-              </w:rPr>
-              <w:t>必要人数</w:t>
-            </w:r>
-          </w:p>
-        </w:tc>
-        <w:tc>
-          <w:tcPr>
-            <w:tcW w:type="dxa" w:w="6236"/>
-          </w:tcPr>
-          <w:p>
-            <w:r>
-              <w:rPr>
-                <w:sz w:val="18"/>
-              </w:rPr>
-              <w:t xml:space="preserve">　　名（最小：　　名 ／ 最大：　　名）</w:t>
-            </w:r>
-          </w:p>
-        </w:tc>
-      </w:tr>
-      <w:tr>
-        <w:tc>
-          <w:tcPr>
-            <w:tcW w:type="dxa" w:w="2551"/>
-            <w:shd w:val="clear" w:color="auto" w:fill="D9E1F2"/>
-          </w:tcPr>
-          <w:p>
-            <w:r>
-              <w:rPr>
-                <w:b/>
-                <w:sz w:val="18"/>
-              </w:rPr>
-              <w:t>業務内容（具体的に）</w:t>
-            </w:r>
-          </w:p>
-        </w:tc>
-        <w:tc>
-          <w:tcPr>
-            <w:tcW w:type="dxa" w:w="6236"/>
-          </w:tcPr>
-          <w:p>
-            <w:r>
-              <w:rPr>
-                <w:sz w:val="18"/>
-              </w:rPr>
-              <w:t xml:space="preserve">　　　　　　　　　　　　　　　　　　　　　　</w:t>
-              <w:br/>
-              <w:t xml:space="preserve">　　　　　　　　　　　　　　　　　　　　　　</w:t>
-            </w:r>
-          </w:p>
-        </w:tc>
-      </w:tr>
-      <w:tr>
-        <w:tc>
-          <w:tcPr>
-            <w:tcW w:type="dxa" w:w="2551"/>
-            <w:shd w:val="clear" w:color="auto" w:fill="D9E1F2"/>
-          </w:tcPr>
-          <w:p>
-            <w:r>
-              <w:rPr>
-                <w:b/>
-                <w:sz w:val="18"/>
-              </w:rPr>
-              <w:t>現場責任者氏名</w:t>
-            </w:r>
-          </w:p>
-        </w:tc>
-        <w:tc>
-          <w:tcPr>
-            <w:tcW w:type="dxa" w:w="6236"/>
-          </w:tcPr>
-          <w:p>
-            <w:r>
-              <w:rPr>
-                <w:sz w:val="18"/>
-              </w:rPr>
-              <w:t xml:space="preserve">　　　　　　　　　　　　　</w:t>
-            </w:r>
-          </w:p>
-        </w:tc>
-      </w:tr>
-      <w:tr>
-        <w:tc>
-          <w:tcPr>
-            <w:tcW w:type="dxa" w:w="2551"/>
-            <w:shd w:val="clear" w:color="auto" w:fill="D9E1F2"/>
-          </w:tcPr>
-          <w:p>
-            <w:r>
-              <w:rPr>
-                <w:b/>
-                <w:sz w:val="18"/>
-              </w:rPr>
-              <w:t>緊急連絡先（携帯）</w:t>
-            </w:r>
-          </w:p>
-        </w:tc>
-        <w:tc>
-          <w:tcPr>
-            <w:tcW w:type="dxa" w:w="6236"/>
-          </w:tcPr>
-          <w:p>
-            <w:r>
-              <w:rPr>
-                <w:sz w:val="18"/>
-              </w:rPr>
-              <w:t xml:space="preserve">　　　－　　　　－　　　　</w:t>
-            </w:r>
-          </w:p>
-        </w:tc>
-      </w:tr>
-      <w:tr>
-        <w:tc>
-          <w:tcPr>
-            <w:tcW w:type="dxa" w:w="2551"/>
-            <w:shd w:val="clear" w:color="auto" w:fill="D9E1F2"/>
-          </w:tcPr>
-          <w:p>
-            <w:r>
-              <w:rPr>
-                <w:b/>
-                <w:sz w:val="18"/>
-              </w:rPr>
-              <w:t>服装・持ち物指定</w:t>
-            </w:r>
-          </w:p>
-        </w:tc>
-        <w:tc>
-          <w:tcPr>
-            <w:tcW w:type="dxa" w:w="6236"/>
-          </w:tcPr>
-          <w:p>
-            <w:r>
-              <w:rPr>
-                <w:sz w:val="18"/>
-              </w:rPr>
-              <w:t>□安全靴　□手袋　□ヘルメット　□その他（　　　　　　）</w:t>
-            </w:r>
-          </w:p>
-        </w:tc>
-      </w:tr>
-      <w:tr>
-        <w:tc>
-          <w:tcPr>
-            <w:tcW w:type="dxa" w:w="2551"/>
-            <w:shd w:val="clear" w:color="auto" w:fill="D9E1F2"/>
-          </w:tcPr>
-          <w:p>
-            <w:r>
-              <w:rPr>
-                <w:b/>
-                <w:sz w:val="18"/>
-              </w:rPr>
-              <w:t>禁止エリアの案内</w:t>
-            </w:r>
-          </w:p>
-        </w:tc>
-        <w:tc>
-          <w:tcPr>
-            <w:tcW w:type="dxa" w:w="6236"/>
-          </w:tcPr>
-          <w:p>
-            <w:r>
-              <w:rPr>
-                <w:sz w:val="18"/>
-              </w:rPr>
-              <w:t>□実施済み　□実施予定（時刻：　　　　）</w:t>
-            </w:r>
-          </w:p>
-        </w:tc>
-      </w:tr>
-      <w:tr>
-        <w:tc>
-          <w:tcPr>
-            <w:tcW w:type="dxa" w:w="2551"/>
-            <w:shd w:val="clear" w:color="auto" w:fill="D9E1F2"/>
-          </w:tcPr>
-          <w:p>
-            <w:r>
-              <w:rPr>
-                <w:b/>
-                <w:sz w:val="18"/>
-              </w:rPr>
-              <w:t>備考</w:t>
-            </w:r>
-          </w:p>
-        </w:tc>
-        <w:tc>
-          <w:tcPr>
-            <w:tcW w:type="dxa" w:w="6236"/>
-          </w:tcPr>
-          <w:p>
-            <w:r>
-              <w:rPr>
-                <w:sz w:val="18"/>
-              </w:rPr>
-              <w:t xml:space="preserve">　　　　　　　　　　　　　　　　　　　　　　</w:t>
-              <w:br/>
-              <w:t xml:space="preserve">　　　　　　　　　　　　　　　　　　　　　　</w:t>
-            </w:r>
-          </w:p>
-        </w:tc>
-      </w:tr>
-    </w:tbl>
-    <w:p>
-      <w:r>
-        <w:br w:type="page"/>
-      </w:r>
-    </w:p>
-    <w:p>
-      <w:pPr>
-        <w:spacing w:before="240" w:after="80"/>
-        <w:jc w:val="center"/>
-      </w:pPr>
-      <w:r>
-        <w:rPr>
-          <w:b/>
-          <w:color w:val="1F497D"/>
-          <w:sz w:val="24"/>
-        </w:rPr>
-        <w:t>【別紙２】　スポットワーカー事故報告書</w:t>
+        <w:t>【別紙１】　スポットワーカー事故報告書</w:t>
       </w:r>
     </w:p>
     <w:p>
@@ -3609,12 +2600,14 @@
         <w:tc>
           <w:tcPr>
             <w:tcW w:type="dxa" w:w="2551"/>
-            <w:shd w:val="clear" w:color="auto" w:fill="FCE4D6"/>
+            <w:shd w:val="clear" w:color="auto" w:fill="D9E1F2"/>
+            <w:vAlign w:val="center"/>
           </w:tcPr>
           <w:p>
             <w:r>
               <w:rPr>
                 <w:b/>
+                <w:color w:val="1A376E"/>
                 <w:sz w:val="18"/>
               </w:rPr>
               <w:t>発生日時</w:t>
@@ -3639,12 +2632,14 @@
         <w:tc>
           <w:tcPr>
             <w:tcW w:type="dxa" w:w="2551"/>
-            <w:shd w:val="clear" w:color="auto" w:fill="FCE4D6"/>
+            <w:shd w:val="clear" w:color="auto" w:fill="D9E1F2"/>
+            <w:vAlign w:val="center"/>
           </w:tcPr>
           <w:p>
             <w:r>
               <w:rPr>
                 <w:b/>
+                <w:color w:val="1A376E"/>
                 <w:sz w:val="18"/>
               </w:rPr>
               <w:t>発生場所（住所）</w:t>
@@ -3662,7 +2657,7 @@
               </w:rPr>
               <w:t xml:space="preserve">〒　　　－　　　　</w:t>
               <w:br/>
-              <w:t xml:space="preserve">　　　　　　　　　　　　　　　　　</w:t>
+              <w:br/>
             </w:r>
           </w:p>
         </w:tc>
@@ -3671,12 +2666,14 @@
         <w:tc>
           <w:tcPr>
             <w:tcW w:type="dxa" w:w="2551"/>
-            <w:shd w:val="clear" w:color="auto" w:fill="FCE4D6"/>
+            <w:shd w:val="clear" w:color="auto" w:fill="D9E1F2"/>
+            <w:vAlign w:val="center"/>
           </w:tcPr>
           <w:p>
             <w:r>
               <w:rPr>
                 <w:b/>
+                <w:color w:val="1A376E"/>
                 <w:sz w:val="18"/>
               </w:rPr>
               <w:t>当事者（ワーカー）</w:t>
@@ -3701,12 +2698,14 @@
         <w:tc>
           <w:tcPr>
             <w:tcW w:type="dxa" w:w="2551"/>
-            <w:shd w:val="clear" w:color="auto" w:fill="FCE4D6"/>
+            <w:shd w:val="clear" w:color="auto" w:fill="D9E1F2"/>
+            <w:vAlign w:val="center"/>
           </w:tcPr>
           <w:p>
             <w:r>
               <w:rPr>
                 <w:b/>
+                <w:color w:val="1A376E"/>
                 <w:sz w:val="18"/>
               </w:rPr>
               <w:t>現場責任者</w:t>
@@ -3731,12 +2730,14 @@
         <w:tc>
           <w:tcPr>
             <w:tcW w:type="dxa" w:w="2551"/>
-            <w:shd w:val="clear" w:color="auto" w:fill="FCE4D6"/>
+            <w:shd w:val="clear" w:color="auto" w:fill="D9E1F2"/>
+            <w:vAlign w:val="center"/>
           </w:tcPr>
           <w:p>
             <w:r>
               <w:rPr>
                 <w:b/>
+                <w:color w:val="1A376E"/>
                 <w:sz w:val="18"/>
               </w:rPr>
               <w:t>事故の概要</w:t>
@@ -3752,9 +2753,8 @@
               <w:rPr>
                 <w:sz w:val="18"/>
               </w:rPr>
-              <w:t xml:space="preserve">　　　　　　　　　　　　　　　　　　　　　　</w:t>
               <w:br/>
-              <w:t xml:space="preserve">　　　　　　　　　　　　　　　　　　　　　　</w:t>
+              <w:br/>
             </w:r>
           </w:p>
         </w:tc>
@@ -3763,12 +2763,14 @@
         <w:tc>
           <w:tcPr>
             <w:tcW w:type="dxa" w:w="2551"/>
-            <w:shd w:val="clear" w:color="auto" w:fill="FCE4D6"/>
+            <w:shd w:val="clear" w:color="auto" w:fill="D9E1F2"/>
+            <w:vAlign w:val="center"/>
           </w:tcPr>
           <w:p>
             <w:r>
               <w:rPr>
                 <w:b/>
+                <w:color w:val="1A376E"/>
                 <w:sz w:val="18"/>
               </w:rPr>
               <w:t>負傷の程度</w:t>
@@ -3793,12 +2795,14 @@
         <w:tc>
           <w:tcPr>
             <w:tcW w:type="dxa" w:w="2551"/>
-            <w:shd w:val="clear" w:color="auto" w:fill="FCE4D6"/>
+            <w:shd w:val="clear" w:color="auto" w:fill="D9E1F2"/>
+            <w:vAlign w:val="center"/>
           </w:tcPr>
           <w:p>
             <w:r>
               <w:rPr>
                 <w:b/>
+                <w:color w:val="1A376E"/>
                 <w:sz w:val="18"/>
               </w:rPr>
               <w:t>応急処置の内容</w:t>
@@ -3814,7 +2818,7 @@
               <w:rPr>
                 <w:sz w:val="18"/>
               </w:rPr>
-              <w:t xml:space="preserve">　　　　　　　　　　　　　　　　　　　　　　</w:t>
+              <w:t xml:space="preserve">　　　　　　　　　　　　　　　　　　　　</w:t>
             </w:r>
           </w:p>
         </w:tc>
@@ -3823,12 +2827,14 @@
         <w:tc>
           <w:tcPr>
             <w:tcW w:type="dxa" w:w="2551"/>
-            <w:shd w:val="clear" w:color="auto" w:fill="FCE4D6"/>
+            <w:shd w:val="clear" w:color="auto" w:fill="D9E1F2"/>
+            <w:vAlign w:val="center"/>
           </w:tcPr>
           <w:p>
             <w:r>
               <w:rPr>
                 <w:b/>
+                <w:color w:val="1A376E"/>
                 <w:sz w:val="18"/>
               </w:rPr>
               <w:t>タイミーへの連絡</w:t>
@@ -3853,12 +2859,14 @@
         <w:tc>
           <w:tcPr>
             <w:tcW w:type="dxa" w:w="2551"/>
-            <w:shd w:val="clear" w:color="auto" w:fill="FCE4D6"/>
+            <w:shd w:val="clear" w:color="auto" w:fill="D9E1F2"/>
+            <w:vAlign w:val="center"/>
           </w:tcPr>
           <w:p>
             <w:r>
               <w:rPr>
                 <w:b/>
+                <w:color w:val="1A376E"/>
                 <w:sz w:val="18"/>
               </w:rPr>
               <w:t>再発防止策</w:t>
@@ -3874,9 +2882,8 @@
               <w:rPr>
                 <w:sz w:val="18"/>
               </w:rPr>
-              <w:t xml:space="preserve">　　　　　　　　　　　　　　　　　　　　　　</w:t>
               <w:br/>
-              <w:t xml:space="preserve">　　　　　　　　　　　　　　　　　　　　　　</w:t>
+              <w:br/>
             </w:r>
           </w:p>
         </w:tc>
@@ -3885,12 +2892,14 @@
         <w:tc>
           <w:tcPr>
             <w:tcW w:type="dxa" w:w="2551"/>
-            <w:shd w:val="clear" w:color="auto" w:fill="FCE4D6"/>
+            <w:shd w:val="clear" w:color="auto" w:fill="D9E1F2"/>
+            <w:vAlign w:val="center"/>
           </w:tcPr>
           <w:p>
             <w:r>
               <w:rPr>
                 <w:b/>
+                <w:color w:val="1A376E"/>
                 <w:sz w:val="18"/>
               </w:rPr>
               <w:t>報告者署名</w:t>

</xml_diff>